<commit_message>
Adiciona capítulo Glossário e Siglas ao Product Report do ITXView
Último capítulo do documento, em ordem alfabética: 14 termos de
interconexão/peering (ASN, BGP, IX.br, E.164, SCM, PPI, POI, LCBR,
Diagrama H, eTOM S/PRM, RGI, CDR) extraídos do material
institucional, do card da Lounge e do texto legível do bundle de
produção — respeitando a nota de escopo do documento sobre a
indisponibilidade do código-fonte do produto.
</commit_message>
<xml_diff>
--- a/docs/produtos/itxview-product-report.docx
+++ b/docs/produtos/itxview-product-report.docx
@@ -272,6 +272,31 @@
           <w:szCs w:val="22"/>
         </w:rPr>
         <w:t xml:space="preserve">	9</w:t>
+      </w:r>
+    </w:p>
+    <w:p>
+      <w:pPr>
+        <w:tabs>
+          <w:tab w:val="right" w:pos="9026" w:leader="dot"/>
+        </w:tabs>
+        <w:spacing w:after="100"/>
+        <w:ind w:left="0"/>
+      </w:pPr>
+      <w:r>
+        <w:rPr>
+          <w:b/>
+          <w:bCs/>
+          <w:sz w:val="22"/>
+          <w:szCs w:val="22"/>
+        </w:rPr>
+        <w:t xml:space="preserve">Glossário e Siglas</w:t>
+      </w:r>
+      <w:r>
+        <w:rPr>
+          <w:sz w:val="22"/>
+          <w:szCs w:val="22"/>
+        </w:rPr>
+        <w:t xml:space="preserve">	10</w:t>
       </w:r>
     </w:p>
     <w:p>
@@ -3216,6 +3241,1642 @@
         </w:tc>
       </w:tr>
     </w:tbl>
+    <w:p>
+      <w:pPr>
+        <w:pStyle w:val="Heading1"/>
+      </w:pPr>
+      <w:r>
+        <w:t xml:space="preserve">Glossário e Siglas</w:t>
+      </w:r>
+    </w:p>
+    <w:p>
+      <w:pPr>
+        <w:spacing w:after="200" w:before="0"/>
+        <w:jc w:val="both"/>
+      </w:pPr>
+      <w:r>
+        <w:rPr>
+          <w:b w:val="false"/>
+          <w:bCs w:val="false"/>
+          <w:i w:val="false"/>
+          <w:iCs w:val="false"/>
+        </w:rPr>
+        <w:t xml:space="preserve">Consolida, em ordem alfabética, as siglas de interconexão/peering e os modelos analíticos citados no material institucional, no card da Lounge e no texto legível do bundle de produção do ITXView ISP Edition — ver nota de escopo no início deste documento sobre a indisponibilidade do código-fonte.</w:t>
+      </w:r>
+    </w:p>
+    <w:tbl>
+      <w:tblPr>
+        <w:tblW w:type="dxa" w:w="9360"/>
+        <w:tblBorders>
+          <w:top w:val="single" w:color="auto" w:sz="4"/>
+          <w:left w:val="single" w:color="auto" w:sz="4"/>
+          <w:bottom w:val="single" w:color="auto" w:sz="4"/>
+          <w:right w:val="single" w:color="auto" w:sz="4"/>
+          <w:insideH w:val="single" w:color="auto" w:sz="4"/>
+          <w:insideV w:val="single" w:color="auto" w:sz="4"/>
+        </w:tblBorders>
+      </w:tblPr>
+      <w:tblGrid>
+        <w:gridCol w:w="2100"/>
+        <w:gridCol w:w="1500"/>
+        <w:gridCol w:w="5760"/>
+      </w:tblGrid>
+      <w:tr>
+        <w:tc>
+          <w:tcPr>
+            <w:tcW w:type="dxa" w:w="2100"/>
+            <w:tcBorders>
+              <w:top w:val="single" w:color="CCCCCC" w:sz="4"/>
+              <w:left w:val="single" w:color="CCCCCC" w:sz="4"/>
+              <w:bottom w:val="single" w:color="CCCCCC" w:sz="4"/>
+              <w:right w:val="single" w:color="CCCCCC" w:sz="4"/>
+            </w:tcBorders>
+            <w:shd w:fill="1F4E79" w:val="clear"/>
+            <w:tcMar>
+              <w:top w:type="dxa" w:w="100"/>
+              <w:left w:type="dxa" w:w="120"/>
+              <w:bottom w:type="dxa" w:w="100"/>
+              <w:right w:type="dxa" w:w="120"/>
+            </w:tcMar>
+            <w:vAlign w:val="center"/>
+          </w:tcPr>
+          <w:p>
+            <w:pPr>
+              <w:jc w:val="left"/>
+            </w:pPr>
+            <w:r>
+              <w:rPr>
+                <w:b/>
+                <w:bCs/>
+                <w:i w:val="false"/>
+                <w:iCs w:val="false"/>
+                <w:color w:val="FFFFFF"/>
+                <w:sz w:val="19"/>
+                <w:szCs w:val="19"/>
+              </w:rPr>
+              <w:t xml:space="preserve">Termo</w:t>
+            </w:r>
+          </w:p>
+        </w:tc>
+        <w:tc>
+          <w:tcPr>
+            <w:tcW w:type="dxa" w:w="1500"/>
+            <w:tcBorders>
+              <w:top w:val="single" w:color="CCCCCC" w:sz="4"/>
+              <w:left w:val="single" w:color="CCCCCC" w:sz="4"/>
+              <w:bottom w:val="single" w:color="CCCCCC" w:sz="4"/>
+              <w:right w:val="single" w:color="CCCCCC" w:sz="4"/>
+            </w:tcBorders>
+            <w:shd w:fill="1F4E79" w:val="clear"/>
+            <w:tcMar>
+              <w:top w:type="dxa" w:w="100"/>
+              <w:left w:type="dxa" w:w="120"/>
+              <w:bottom w:type="dxa" w:w="100"/>
+              <w:right w:type="dxa" w:w="120"/>
+            </w:tcMar>
+            <w:vAlign w:val="center"/>
+          </w:tcPr>
+          <w:p>
+            <w:pPr>
+              <w:jc w:val="left"/>
+            </w:pPr>
+            <w:r>
+              <w:rPr>
+                <w:b/>
+                <w:bCs/>
+                <w:i w:val="false"/>
+                <w:iCs w:val="false"/>
+                <w:color w:val="FFFFFF"/>
+                <w:sz w:val="19"/>
+                <w:szCs w:val="19"/>
+              </w:rPr>
+              <w:t xml:space="preserve">Categoria</w:t>
+            </w:r>
+          </w:p>
+        </w:tc>
+        <w:tc>
+          <w:tcPr>
+            <w:tcW w:type="dxa" w:w="5760"/>
+            <w:tcBorders>
+              <w:top w:val="single" w:color="CCCCCC" w:sz="4"/>
+              <w:left w:val="single" w:color="CCCCCC" w:sz="4"/>
+              <w:bottom w:val="single" w:color="CCCCCC" w:sz="4"/>
+              <w:right w:val="single" w:color="CCCCCC" w:sz="4"/>
+            </w:tcBorders>
+            <w:shd w:fill="1F4E79" w:val="clear"/>
+            <w:tcMar>
+              <w:top w:type="dxa" w:w="100"/>
+              <w:left w:type="dxa" w:w="120"/>
+              <w:bottom w:type="dxa" w:w="100"/>
+              <w:right w:type="dxa" w:w="120"/>
+            </w:tcMar>
+            <w:vAlign w:val="center"/>
+          </w:tcPr>
+          <w:p>
+            <w:pPr>
+              <w:jc w:val="left"/>
+            </w:pPr>
+            <w:r>
+              <w:rPr>
+                <w:b/>
+                <w:bCs/>
+                <w:i w:val="false"/>
+                <w:iCs w:val="false"/>
+                <w:color w:val="FFFFFF"/>
+                <w:sz w:val="19"/>
+                <w:szCs w:val="19"/>
+              </w:rPr>
+              <w:t xml:space="preserve">Definição</w:t>
+            </w:r>
+          </w:p>
+        </w:tc>
+      </w:tr>
+      <w:tr>
+        <w:tc>
+          <w:tcPr>
+            <w:tcW w:type="dxa" w:w="2100"/>
+            <w:tcBorders>
+              <w:top w:val="single" w:color="CCCCCC" w:sz="4"/>
+              <w:left w:val="single" w:color="CCCCCC" w:sz="4"/>
+              <w:bottom w:val="single" w:color="CCCCCC" w:sz="4"/>
+              <w:right w:val="single" w:color="CCCCCC" w:sz="4"/>
+            </w:tcBorders>
+            <w:tcMar>
+              <w:top w:type="dxa" w:w="100"/>
+              <w:left w:type="dxa" w:w="120"/>
+              <w:bottom w:type="dxa" w:w="100"/>
+              <w:right w:type="dxa" w:w="120"/>
+            </w:tcMar>
+            <w:vAlign w:val="center"/>
+          </w:tcPr>
+          <w:p>
+            <w:pPr>
+              <w:jc w:val="left"/>
+            </w:pPr>
+            <w:r>
+              <w:rPr>
+                <w:b/>
+                <w:bCs/>
+                <w:i w:val="false"/>
+                <w:iCs w:val="false"/>
+                <w:sz w:val="19"/>
+                <w:szCs w:val="19"/>
+              </w:rPr>
+              <w:t xml:space="preserve">ASN</w:t>
+            </w:r>
+          </w:p>
+        </w:tc>
+        <w:tc>
+          <w:tcPr>
+            <w:tcW w:type="dxa" w:w="1500"/>
+            <w:tcBorders>
+              <w:top w:val="single" w:color="CCCCCC" w:sz="4"/>
+              <w:left w:val="single" w:color="CCCCCC" w:sz="4"/>
+              <w:bottom w:val="single" w:color="CCCCCC" w:sz="4"/>
+              <w:right w:val="single" w:color="CCCCCC" w:sz="4"/>
+            </w:tcBorders>
+            <w:tcMar>
+              <w:top w:type="dxa" w:w="100"/>
+              <w:left w:type="dxa" w:w="120"/>
+              <w:bottom w:type="dxa" w:w="100"/>
+              <w:right w:type="dxa" w:w="120"/>
+            </w:tcMar>
+            <w:vAlign w:val="center"/>
+          </w:tcPr>
+          <w:p>
+            <w:pPr>
+              <w:jc w:val="left"/>
+            </w:pPr>
+            <w:r>
+              <w:rPr>
+                <w:b w:val="false"/>
+                <w:bCs w:val="false"/>
+                <w:i w:val="false"/>
+                <w:iCs w:val="false"/>
+                <w:color w:val="4A6A8A"/>
+                <w:sz w:val="19"/>
+                <w:szCs w:val="19"/>
+              </w:rPr>
+              <w:t xml:space="preserve">Sigla</w:t>
+            </w:r>
+          </w:p>
+        </w:tc>
+        <w:tc>
+          <w:tcPr>
+            <w:tcW w:type="dxa" w:w="5760"/>
+            <w:tcBorders>
+              <w:top w:val="single" w:color="CCCCCC" w:sz="4"/>
+              <w:left w:val="single" w:color="CCCCCC" w:sz="4"/>
+              <w:bottom w:val="single" w:color="CCCCCC" w:sz="4"/>
+              <w:right w:val="single" w:color="CCCCCC" w:sz="4"/>
+            </w:tcBorders>
+            <w:tcMar>
+              <w:top w:type="dxa" w:w="100"/>
+              <w:left w:type="dxa" w:w="120"/>
+              <w:bottom w:type="dxa" w:w="100"/>
+              <w:right w:type="dxa" w:w="120"/>
+            </w:tcMar>
+            <w:vAlign w:val="center"/>
+          </w:tcPr>
+          <w:p>
+            <w:pPr>
+              <w:jc w:val="left"/>
+            </w:pPr>
+            <w:r>
+              <w:rPr>
+                <w:b w:val="false"/>
+                <w:bCs w:val="false"/>
+                <w:i w:val="false"/>
+                <w:iCs w:val="false"/>
+                <w:sz w:val="19"/>
+                <w:szCs w:val="19"/>
+              </w:rPr>
+              <w:t xml:space="preserve">Autonomous System Number — identificador de sistema autônomo; base da faixa de precificação institucional citada (R$ 3.500–12.000/mês por ASN).</w:t>
+            </w:r>
+          </w:p>
+        </w:tc>
+      </w:tr>
+      <w:tr>
+        <w:tc>
+          <w:tcPr>
+            <w:tcW w:type="dxa" w:w="2100"/>
+            <w:tcBorders>
+              <w:top w:val="single" w:color="CCCCCC" w:sz="4"/>
+              <w:left w:val="single" w:color="CCCCCC" w:sz="4"/>
+              <w:bottom w:val="single" w:color="CCCCCC" w:sz="4"/>
+              <w:right w:val="single" w:color="CCCCCC" w:sz="4"/>
+            </w:tcBorders>
+            <w:tcMar>
+              <w:top w:type="dxa" w:w="100"/>
+              <w:left w:type="dxa" w:w="120"/>
+              <w:bottom w:type="dxa" w:w="100"/>
+              <w:right w:type="dxa" w:w="120"/>
+            </w:tcMar>
+            <w:vAlign w:val="center"/>
+          </w:tcPr>
+          <w:p>
+            <w:pPr>
+              <w:jc w:val="left"/>
+            </w:pPr>
+            <w:r>
+              <w:rPr>
+                <w:b/>
+                <w:bCs/>
+                <w:i w:val="false"/>
+                <w:iCs w:val="false"/>
+                <w:sz w:val="19"/>
+                <w:szCs w:val="19"/>
+              </w:rPr>
+              <w:t xml:space="preserve">BGP</w:t>
+            </w:r>
+          </w:p>
+        </w:tc>
+        <w:tc>
+          <w:tcPr>
+            <w:tcW w:type="dxa" w:w="1500"/>
+            <w:tcBorders>
+              <w:top w:val="single" w:color="CCCCCC" w:sz="4"/>
+              <w:left w:val="single" w:color="CCCCCC" w:sz="4"/>
+              <w:bottom w:val="single" w:color="CCCCCC" w:sz="4"/>
+              <w:right w:val="single" w:color="CCCCCC" w:sz="4"/>
+            </w:tcBorders>
+            <w:tcMar>
+              <w:top w:type="dxa" w:w="100"/>
+              <w:left w:type="dxa" w:w="120"/>
+              <w:bottom w:type="dxa" w:w="100"/>
+              <w:right w:type="dxa" w:w="120"/>
+            </w:tcMar>
+            <w:vAlign w:val="center"/>
+          </w:tcPr>
+          <w:p>
+            <w:pPr>
+              <w:jc w:val="left"/>
+            </w:pPr>
+            <w:r>
+              <w:rPr>
+                <w:b w:val="false"/>
+                <w:bCs w:val="false"/>
+                <w:i w:val="false"/>
+                <w:iCs w:val="false"/>
+                <w:color w:val="4A6A8A"/>
+                <w:sz w:val="19"/>
+                <w:szCs w:val="19"/>
+              </w:rPr>
+              <w:t xml:space="preserve">Sigla</w:t>
+            </w:r>
+          </w:p>
+        </w:tc>
+        <w:tc>
+          <w:tcPr>
+            <w:tcW w:type="dxa" w:w="5760"/>
+            <w:tcBorders>
+              <w:top w:val="single" w:color="CCCCCC" w:sz="4"/>
+              <w:left w:val="single" w:color="CCCCCC" w:sz="4"/>
+              <w:bottom w:val="single" w:color="CCCCCC" w:sz="4"/>
+              <w:right w:val="single" w:color="CCCCCC" w:sz="4"/>
+            </w:tcBorders>
+            <w:tcMar>
+              <w:top w:type="dxa" w:w="100"/>
+              <w:left w:type="dxa" w:w="120"/>
+              <w:bottom w:type="dxa" w:w="100"/>
+              <w:right w:type="dxa" w:w="120"/>
+            </w:tcMar>
+            <w:vAlign w:val="center"/>
+          </w:tcPr>
+          <w:p>
+            <w:pPr>
+              <w:jc w:val="left"/>
+            </w:pPr>
+            <w:r>
+              <w:rPr>
+                <w:b w:val="false"/>
+                <w:bCs w:val="false"/>
+                <w:i w:val="false"/>
+                <w:iCs w:val="false"/>
+                <w:sz w:val="19"/>
+                <w:szCs w:val="19"/>
+              </w:rPr>
+              <w:t xml:space="preserve">Border Gateway Protocol — protocolo de roteamento entre sistemas autônomos, citado junto ao IX.br na cobertura de peering/trânsito de dados.</w:t>
+            </w:r>
+          </w:p>
+        </w:tc>
+      </w:tr>
+      <w:tr>
+        <w:tc>
+          <w:tcPr>
+            <w:tcW w:type="dxa" w:w="2100"/>
+            <w:tcBorders>
+              <w:top w:val="single" w:color="CCCCCC" w:sz="4"/>
+              <w:left w:val="single" w:color="CCCCCC" w:sz="4"/>
+              <w:bottom w:val="single" w:color="CCCCCC" w:sz="4"/>
+              <w:right w:val="single" w:color="CCCCCC" w:sz="4"/>
+            </w:tcBorders>
+            <w:tcMar>
+              <w:top w:type="dxa" w:w="100"/>
+              <w:left w:type="dxa" w:w="120"/>
+              <w:bottom w:type="dxa" w:w="100"/>
+              <w:right w:type="dxa" w:w="120"/>
+            </w:tcMar>
+            <w:vAlign w:val="center"/>
+          </w:tcPr>
+          <w:p>
+            <w:pPr>
+              <w:jc w:val="left"/>
+            </w:pPr>
+            <w:r>
+              <w:rPr>
+                <w:b/>
+                <w:bCs/>
+                <w:i w:val="false"/>
+                <w:iCs w:val="false"/>
+                <w:sz w:val="19"/>
+                <w:szCs w:val="19"/>
+              </w:rPr>
+              <w:t xml:space="preserve">Camada Bayesiana</w:t>
+            </w:r>
+          </w:p>
+        </w:tc>
+        <w:tc>
+          <w:tcPr>
+            <w:tcW w:type="dxa" w:w="1500"/>
+            <w:tcBorders>
+              <w:top w:val="single" w:color="CCCCCC" w:sz="4"/>
+              <w:left w:val="single" w:color="CCCCCC" w:sz="4"/>
+              <w:bottom w:val="single" w:color="CCCCCC" w:sz="4"/>
+              <w:right w:val="single" w:color="CCCCCC" w:sz="4"/>
+            </w:tcBorders>
+            <w:tcMar>
+              <w:top w:type="dxa" w:w="100"/>
+              <w:left w:type="dxa" w:w="120"/>
+              <w:bottom w:type="dxa" w:w="100"/>
+              <w:right w:type="dxa" w:w="120"/>
+            </w:tcMar>
+            <w:vAlign w:val="center"/>
+          </w:tcPr>
+          <w:p>
+            <w:pPr>
+              <w:jc w:val="left"/>
+            </w:pPr>
+            <w:r>
+              <w:rPr>
+                <w:b w:val="false"/>
+                <w:bCs w:val="false"/>
+                <w:i w:val="false"/>
+                <w:iCs w:val="false"/>
+                <w:color w:val="4A6A8A"/>
+                <w:sz w:val="19"/>
+                <w:szCs w:val="19"/>
+              </w:rPr>
+              <w:t xml:space="preserve">Modelo/Técnica</w:t>
+            </w:r>
+          </w:p>
+        </w:tc>
+        <w:tc>
+          <w:tcPr>
+            <w:tcW w:type="dxa" w:w="5760"/>
+            <w:tcBorders>
+              <w:top w:val="single" w:color="CCCCCC" w:sz="4"/>
+              <w:left w:val="single" w:color="CCCCCC" w:sz="4"/>
+              <w:bottom w:val="single" w:color="CCCCCC" w:sz="4"/>
+              <w:right w:val="single" w:color="CCCCCC" w:sz="4"/>
+            </w:tcBorders>
+            <w:tcMar>
+              <w:top w:type="dxa" w:w="100"/>
+              <w:left w:type="dxa" w:w="120"/>
+              <w:bottom w:type="dxa" w:w="100"/>
+              <w:right w:type="dxa" w:w="120"/>
+            </w:tcMar>
+            <w:vAlign w:val="center"/>
+          </w:tcPr>
+          <w:p>
+            <w:pPr>
+              <w:jc w:val="left"/>
+            </w:pPr>
+            <w:r>
+              <w:rPr>
+                <w:b w:val="false"/>
+                <w:bCs w:val="false"/>
+                <w:i w:val="false"/>
+                <w:iCs w:val="false"/>
+                <w:sz w:val="19"/>
+                <w:szCs w:val="19"/>
+              </w:rPr>
+              <w:t xml:space="preserve">Score de causa provável entre hipóteses concorrentes (ex. sobrecarga real, erro de roteamento, falha de central) para cada alerta — a própria documentação interna do produto (citada pelo JourneyGraph) a descreve como score, não necessariamente um modelo Bayesiano formal com posterior real.</w:t>
+            </w:r>
+          </w:p>
+        </w:tc>
+      </w:tr>
+      <w:tr>
+        <w:tc>
+          <w:tcPr>
+            <w:tcW w:type="dxa" w:w="2100"/>
+            <w:tcBorders>
+              <w:top w:val="single" w:color="CCCCCC" w:sz="4"/>
+              <w:left w:val="single" w:color="CCCCCC" w:sz="4"/>
+              <w:bottom w:val="single" w:color="CCCCCC" w:sz="4"/>
+              <w:right w:val="single" w:color="CCCCCC" w:sz="4"/>
+            </w:tcBorders>
+            <w:tcMar>
+              <w:top w:type="dxa" w:w="100"/>
+              <w:left w:type="dxa" w:w="120"/>
+              <w:bottom w:type="dxa" w:w="100"/>
+              <w:right w:type="dxa" w:w="120"/>
+            </w:tcMar>
+            <w:vAlign w:val="center"/>
+          </w:tcPr>
+          <w:p>
+            <w:pPr>
+              <w:jc w:val="left"/>
+            </w:pPr>
+            <w:r>
+              <w:rPr>
+                <w:b/>
+                <w:bCs/>
+                <w:i w:val="false"/>
+                <w:iCs w:val="false"/>
+                <w:sz w:val="19"/>
+                <w:szCs w:val="19"/>
+              </w:rPr>
+              <w:t xml:space="preserve">Camada de Markov</w:t>
+            </w:r>
+          </w:p>
+        </w:tc>
+        <w:tc>
+          <w:tcPr>
+            <w:tcW w:type="dxa" w:w="1500"/>
+            <w:tcBorders>
+              <w:top w:val="single" w:color="CCCCCC" w:sz="4"/>
+              <w:left w:val="single" w:color="CCCCCC" w:sz="4"/>
+              <w:bottom w:val="single" w:color="CCCCCC" w:sz="4"/>
+              <w:right w:val="single" w:color="CCCCCC" w:sz="4"/>
+            </w:tcBorders>
+            <w:tcMar>
+              <w:top w:type="dxa" w:w="100"/>
+              <w:left w:type="dxa" w:w="120"/>
+              <w:bottom w:type="dxa" w:w="100"/>
+              <w:right w:type="dxa" w:w="120"/>
+            </w:tcMar>
+            <w:vAlign w:val="center"/>
+          </w:tcPr>
+          <w:p>
+            <w:pPr>
+              <w:jc w:val="left"/>
+            </w:pPr>
+            <w:r>
+              <w:rPr>
+                <w:b w:val="false"/>
+                <w:bCs w:val="false"/>
+                <w:i w:val="false"/>
+                <w:iCs w:val="false"/>
+                <w:color w:val="4A6A8A"/>
+                <w:sz w:val="19"/>
+                <w:szCs w:val="19"/>
+              </w:rPr>
+              <w:t xml:space="preserve">Modelo/Técnica</w:t>
+            </w:r>
+          </w:p>
+        </w:tc>
+        <w:tc>
+          <w:tcPr>
+            <w:tcW w:type="dxa" w:w="5760"/>
+            <w:tcBorders>
+              <w:top w:val="single" w:color="CCCCCC" w:sz="4"/>
+              <w:left w:val="single" w:color="CCCCCC" w:sz="4"/>
+              <w:bottom w:val="single" w:color="CCCCCC" w:sz="4"/>
+              <w:right w:val="single" w:color="CCCCCC" w:sz="4"/>
+            </w:tcBorders>
+            <w:tcMar>
+              <w:top w:type="dxa" w:w="100"/>
+              <w:left w:type="dxa" w:w="120"/>
+              <w:bottom w:type="dxa" w:w="100"/>
+              <w:right w:type="dxa" w:w="120"/>
+            </w:tcMar>
+            <w:vAlign w:val="center"/>
+          </w:tcPr>
+          <w:p>
+            <w:pPr>
+              <w:jc w:val="left"/>
+            </w:pPr>
+            <w:r>
+              <w:rPr>
+                <w:b w:val="false"/>
+                <w:bCs w:val="false"/>
+                <w:i w:val="false"/>
+                <w:iCs w:val="false"/>
+                <w:sz w:val="19"/>
+                <w:szCs w:val="19"/>
+              </w:rPr>
+              <w:t xml:space="preserve">Estima a probabilidade de uma rota ou sessão transitar para um estado mais crítico na próxima janela de tempo; mesma ressalva de verificação da Camada Bayesiana — terminologia correta, fórmula não inspecionável sem código-fonte.</w:t>
+            </w:r>
+          </w:p>
+        </w:tc>
+      </w:tr>
+      <w:tr>
+        <w:tc>
+          <w:tcPr>
+            <w:tcW w:type="dxa" w:w="2100"/>
+            <w:tcBorders>
+              <w:top w:val="single" w:color="CCCCCC" w:sz="4"/>
+              <w:left w:val="single" w:color="CCCCCC" w:sz="4"/>
+              <w:bottom w:val="single" w:color="CCCCCC" w:sz="4"/>
+              <w:right w:val="single" w:color="CCCCCC" w:sz="4"/>
+            </w:tcBorders>
+            <w:tcMar>
+              <w:top w:type="dxa" w:w="100"/>
+              <w:left w:type="dxa" w:w="120"/>
+              <w:bottom w:type="dxa" w:w="100"/>
+              <w:right w:type="dxa" w:w="120"/>
+            </w:tcMar>
+            <w:vAlign w:val="center"/>
+          </w:tcPr>
+          <w:p>
+            <w:pPr>
+              <w:jc w:val="left"/>
+            </w:pPr>
+            <w:r>
+              <w:rPr>
+                <w:b/>
+                <w:bCs/>
+                <w:i w:val="false"/>
+                <w:iCs w:val="false"/>
+                <w:sz w:val="19"/>
+                <w:szCs w:val="19"/>
+              </w:rPr>
+              <w:t xml:space="preserve">CDR</w:t>
+            </w:r>
+          </w:p>
+        </w:tc>
+        <w:tc>
+          <w:tcPr>
+            <w:tcW w:type="dxa" w:w="1500"/>
+            <w:tcBorders>
+              <w:top w:val="single" w:color="CCCCCC" w:sz="4"/>
+              <w:left w:val="single" w:color="CCCCCC" w:sz="4"/>
+              <w:bottom w:val="single" w:color="CCCCCC" w:sz="4"/>
+              <w:right w:val="single" w:color="CCCCCC" w:sz="4"/>
+            </w:tcBorders>
+            <w:tcMar>
+              <w:top w:type="dxa" w:w="100"/>
+              <w:left w:type="dxa" w:w="120"/>
+              <w:bottom w:type="dxa" w:w="100"/>
+              <w:right w:type="dxa" w:w="120"/>
+            </w:tcMar>
+            <w:vAlign w:val="center"/>
+          </w:tcPr>
+          <w:p>
+            <w:pPr>
+              <w:jc w:val="left"/>
+            </w:pPr>
+            <w:r>
+              <w:rPr>
+                <w:b w:val="false"/>
+                <w:bCs w:val="false"/>
+                <w:i w:val="false"/>
+                <w:iCs w:val="false"/>
+                <w:color w:val="4A6A8A"/>
+                <w:sz w:val="19"/>
+                <w:szCs w:val="19"/>
+              </w:rPr>
+              <w:t xml:space="preserve">Sigla</w:t>
+            </w:r>
+          </w:p>
+        </w:tc>
+        <w:tc>
+          <w:tcPr>
+            <w:tcW w:type="dxa" w:w="5760"/>
+            <w:tcBorders>
+              <w:top w:val="single" w:color="CCCCCC" w:sz="4"/>
+              <w:left w:val="single" w:color="CCCCCC" w:sz="4"/>
+              <w:bottom w:val="single" w:color="CCCCCC" w:sz="4"/>
+              <w:right w:val="single" w:color="CCCCCC" w:sz="4"/>
+            </w:tcBorders>
+            <w:tcMar>
+              <w:top w:type="dxa" w:w="100"/>
+              <w:left w:type="dxa" w:w="120"/>
+              <w:bottom w:type="dxa" w:w="100"/>
+              <w:right w:type="dxa" w:w="120"/>
+            </w:tcMar>
+            <w:vAlign w:val="center"/>
+          </w:tcPr>
+          <w:p>
+            <w:pPr>
+              <w:jc w:val="left"/>
+            </w:pPr>
+            <w:r>
+              <w:rPr>
+                <w:b w:val="false"/>
+                <w:bCs w:val="false"/>
+                <w:i w:val="false"/>
+                <w:iCs w:val="false"/>
+                <w:sz w:val="19"/>
+                <w:szCs w:val="19"/>
+              </w:rPr>
+              <w:t xml:space="preserve">Call Detail Record — registro de chamada de voz consumido pelo produto, segundo o material institucional da Vísent.</w:t>
+            </w:r>
+          </w:p>
+        </w:tc>
+      </w:tr>
+      <w:tr>
+        <w:tc>
+          <w:tcPr>
+            <w:tcW w:type="dxa" w:w="2100"/>
+            <w:tcBorders>
+              <w:top w:val="single" w:color="CCCCCC" w:sz="4"/>
+              <w:left w:val="single" w:color="CCCCCC" w:sz="4"/>
+              <w:bottom w:val="single" w:color="CCCCCC" w:sz="4"/>
+              <w:right w:val="single" w:color="CCCCCC" w:sz="4"/>
+            </w:tcBorders>
+            <w:tcMar>
+              <w:top w:type="dxa" w:w="100"/>
+              <w:left w:type="dxa" w:w="120"/>
+              <w:bottom w:type="dxa" w:w="100"/>
+              <w:right w:type="dxa" w:w="120"/>
+            </w:tcMar>
+            <w:vAlign w:val="center"/>
+          </w:tcPr>
+          <w:p>
+            <w:pPr>
+              <w:jc w:val="left"/>
+            </w:pPr>
+            <w:r>
+              <w:rPr>
+                <w:b/>
+                <w:bCs/>
+                <w:i w:val="false"/>
+                <w:iCs w:val="false"/>
+                <w:sz w:val="19"/>
+                <w:szCs w:val="19"/>
+              </w:rPr>
+              <w:t xml:space="preserve">Diagrama H</w:t>
+            </w:r>
+          </w:p>
+        </w:tc>
+        <w:tc>
+          <w:tcPr>
+            <w:tcW w:type="dxa" w:w="1500"/>
+            <w:tcBorders>
+              <w:top w:val="single" w:color="CCCCCC" w:sz="4"/>
+              <w:left w:val="single" w:color="CCCCCC" w:sz="4"/>
+              <w:bottom w:val="single" w:color="CCCCCC" w:sz="4"/>
+              <w:right w:val="single" w:color="CCCCCC" w:sz="4"/>
+            </w:tcBorders>
+            <w:tcMar>
+              <w:top w:type="dxa" w:w="100"/>
+              <w:left w:type="dxa" w:w="120"/>
+              <w:bottom w:type="dxa" w:w="100"/>
+              <w:right w:type="dxa" w:w="120"/>
+            </w:tcMar>
+            <w:vAlign w:val="center"/>
+          </w:tcPr>
+          <w:p>
+            <w:pPr>
+              <w:jc w:val="left"/>
+            </w:pPr>
+            <w:r>
+              <w:rPr>
+                <w:b w:val="false"/>
+                <w:bCs w:val="false"/>
+                <w:i w:val="false"/>
+                <w:iCs w:val="false"/>
+                <w:color w:val="4A6A8A"/>
+                <w:sz w:val="19"/>
+                <w:szCs w:val="19"/>
+              </w:rPr>
+              <w:t xml:space="preserve">Modelo/Técnica</w:t>
+            </w:r>
+          </w:p>
+        </w:tc>
+        <w:tc>
+          <w:tcPr>
+            <w:tcW w:type="dxa" w:w="5760"/>
+            <w:tcBorders>
+              <w:top w:val="single" w:color="CCCCCC" w:sz="4"/>
+              <w:left w:val="single" w:color="CCCCCC" w:sz="4"/>
+              <w:bottom w:val="single" w:color="CCCCCC" w:sz="4"/>
+              <w:right w:val="single" w:color="CCCCCC" w:sz="4"/>
+            </w:tcBorders>
+            <w:tcMar>
+              <w:top w:type="dxa" w:w="100"/>
+              <w:left w:type="dxa" w:w="120"/>
+              <w:bottom w:type="dxa" w:w="100"/>
+              <w:right w:type="dxa" w:w="120"/>
+            </w:tcMar>
+            <w:vAlign w:val="center"/>
+          </w:tcPr>
+          <w:p>
+            <w:pPr>
+              <w:jc w:val="left"/>
+            </w:pPr>
+            <w:r>
+              <w:rPr>
+                <w:b w:val="false"/>
+                <w:bCs w:val="false"/>
+                <w:i w:val="false"/>
+                <w:iCs w:val="false"/>
+                <w:sz w:val="19"/>
+                <w:szCs w:val="19"/>
+              </w:rPr>
+              <w:t xml:space="preserve">Classifica o tráfego em torno de um POI em 4 cenários (interno, saída, entrada, trânsito/transporte); cada aresta do grafo multiplex recebe esse atributo como tag de contexto.</w:t>
+            </w:r>
+          </w:p>
+        </w:tc>
+      </w:tr>
+      <w:tr>
+        <w:tc>
+          <w:tcPr>
+            <w:tcW w:type="dxa" w:w="2100"/>
+            <w:tcBorders>
+              <w:top w:val="single" w:color="CCCCCC" w:sz="4"/>
+              <w:left w:val="single" w:color="CCCCCC" w:sz="4"/>
+              <w:bottom w:val="single" w:color="CCCCCC" w:sz="4"/>
+              <w:right w:val="single" w:color="CCCCCC" w:sz="4"/>
+            </w:tcBorders>
+            <w:tcMar>
+              <w:top w:type="dxa" w:w="100"/>
+              <w:left w:type="dxa" w:w="120"/>
+              <w:bottom w:type="dxa" w:w="100"/>
+              <w:right w:type="dxa" w:w="120"/>
+            </w:tcMar>
+            <w:vAlign w:val="center"/>
+          </w:tcPr>
+          <w:p>
+            <w:pPr>
+              <w:jc w:val="left"/>
+            </w:pPr>
+            <w:r>
+              <w:rPr>
+                <w:b/>
+                <w:bCs/>
+                <w:i w:val="false"/>
+                <w:iCs w:val="false"/>
+                <w:sz w:val="19"/>
+                <w:szCs w:val="19"/>
+              </w:rPr>
+              <w:t xml:space="preserve">E.164</w:t>
+            </w:r>
+          </w:p>
+        </w:tc>
+        <w:tc>
+          <w:tcPr>
+            <w:tcW w:type="dxa" w:w="1500"/>
+            <w:tcBorders>
+              <w:top w:val="single" w:color="CCCCCC" w:sz="4"/>
+              <w:left w:val="single" w:color="CCCCCC" w:sz="4"/>
+              <w:bottom w:val="single" w:color="CCCCCC" w:sz="4"/>
+              <w:right w:val="single" w:color="CCCCCC" w:sz="4"/>
+            </w:tcBorders>
+            <w:tcMar>
+              <w:top w:type="dxa" w:w="100"/>
+              <w:left w:type="dxa" w:w="120"/>
+              <w:bottom w:type="dxa" w:w="100"/>
+              <w:right w:type="dxa" w:w="120"/>
+            </w:tcMar>
+            <w:vAlign w:val="center"/>
+          </w:tcPr>
+          <w:p>
+            <w:pPr>
+              <w:jc w:val="left"/>
+            </w:pPr>
+            <w:r>
+              <w:rPr>
+                <w:b w:val="false"/>
+                <w:bCs w:val="false"/>
+                <w:i w:val="false"/>
+                <w:iCs w:val="false"/>
+                <w:color w:val="4A6A8A"/>
+                <w:sz w:val="19"/>
+                <w:szCs w:val="19"/>
+              </w:rPr>
+              <w:t xml:space="preserve">Sigla</w:t>
+            </w:r>
+          </w:p>
+        </w:tc>
+        <w:tc>
+          <w:tcPr>
+            <w:tcW w:type="dxa" w:w="5760"/>
+            <w:tcBorders>
+              <w:top w:val="single" w:color="CCCCCC" w:sz="4"/>
+              <w:left w:val="single" w:color="CCCCCC" w:sz="4"/>
+              <w:bottom w:val="single" w:color="CCCCCC" w:sz="4"/>
+              <w:right w:val="single" w:color="CCCCCC" w:sz="4"/>
+            </w:tcBorders>
+            <w:tcMar>
+              <w:top w:type="dxa" w:w="100"/>
+              <w:left w:type="dxa" w:w="120"/>
+              <w:bottom w:type="dxa" w:w="100"/>
+              <w:right w:type="dxa" w:w="120"/>
+            </w:tcMar>
+            <w:vAlign w:val="center"/>
+          </w:tcPr>
+          <w:p>
+            <w:pPr>
+              <w:jc w:val="left"/>
+            </w:pPr>
+            <w:r>
+              <w:rPr>
+                <w:b w:val="false"/>
+                <w:bCs w:val="false"/>
+                <w:i w:val="false"/>
+                <w:iCs w:val="false"/>
+                <w:sz w:val="19"/>
+                <w:szCs w:val="19"/>
+              </w:rPr>
+              <w:t xml:space="preserve">Padrão internacional de numeração de telecomunicações; a Anatel estende sua exigência ao SCM a partir de 1º de março de 2027.</w:t>
+            </w:r>
+          </w:p>
+        </w:tc>
+      </w:tr>
+      <w:tr>
+        <w:tc>
+          <w:tcPr>
+            <w:tcW w:type="dxa" w:w="2100"/>
+            <w:tcBorders>
+              <w:top w:val="single" w:color="CCCCCC" w:sz="4"/>
+              <w:left w:val="single" w:color="CCCCCC" w:sz="4"/>
+              <w:bottom w:val="single" w:color="CCCCCC" w:sz="4"/>
+              <w:right w:val="single" w:color="CCCCCC" w:sz="4"/>
+            </w:tcBorders>
+            <w:tcMar>
+              <w:top w:type="dxa" w:w="100"/>
+              <w:left w:type="dxa" w:w="120"/>
+              <w:bottom w:type="dxa" w:w="100"/>
+              <w:right w:type="dxa" w:w="120"/>
+            </w:tcMar>
+            <w:vAlign w:val="center"/>
+          </w:tcPr>
+          <w:p>
+            <w:pPr>
+              <w:jc w:val="left"/>
+            </w:pPr>
+            <w:r>
+              <w:rPr>
+                <w:b/>
+                <w:bCs/>
+                <w:i w:val="false"/>
+                <w:iCs w:val="false"/>
+                <w:sz w:val="19"/>
+                <w:szCs w:val="19"/>
+              </w:rPr>
+              <w:t xml:space="preserve">eTOM S/PRM</w:t>
+            </w:r>
+          </w:p>
+        </w:tc>
+        <w:tc>
+          <w:tcPr>
+            <w:tcW w:type="dxa" w:w="1500"/>
+            <w:tcBorders>
+              <w:top w:val="single" w:color="CCCCCC" w:sz="4"/>
+              <w:left w:val="single" w:color="CCCCCC" w:sz="4"/>
+              <w:bottom w:val="single" w:color="CCCCCC" w:sz="4"/>
+              <w:right w:val="single" w:color="CCCCCC" w:sz="4"/>
+            </w:tcBorders>
+            <w:tcMar>
+              <w:top w:type="dxa" w:w="100"/>
+              <w:left w:type="dxa" w:w="120"/>
+              <w:bottom w:type="dxa" w:w="100"/>
+              <w:right w:type="dxa" w:w="120"/>
+            </w:tcMar>
+            <w:vAlign w:val="center"/>
+          </w:tcPr>
+          <w:p>
+            <w:pPr>
+              <w:jc w:val="left"/>
+            </w:pPr>
+            <w:r>
+              <w:rPr>
+                <w:b w:val="false"/>
+                <w:bCs w:val="false"/>
+                <w:i w:val="false"/>
+                <w:iCs w:val="false"/>
+                <w:color w:val="4A6A8A"/>
+                <w:sz w:val="19"/>
+                <w:szCs w:val="19"/>
+              </w:rPr>
+              <w:t xml:space="preserve">Norma/Framework</w:t>
+            </w:r>
+          </w:p>
+        </w:tc>
+        <w:tc>
+          <w:tcPr>
+            <w:tcW w:type="dxa" w:w="5760"/>
+            <w:tcBorders>
+              <w:top w:val="single" w:color="CCCCCC" w:sz="4"/>
+              <w:left w:val="single" w:color="CCCCCC" w:sz="4"/>
+              <w:bottom w:val="single" w:color="CCCCCC" w:sz="4"/>
+              <w:right w:val="single" w:color="CCCCCC" w:sz="4"/>
+            </w:tcBorders>
+            <w:tcMar>
+              <w:top w:type="dxa" w:w="100"/>
+              <w:left w:type="dxa" w:w="120"/>
+              <w:bottom w:type="dxa" w:w="100"/>
+              <w:right w:type="dxa" w:w="120"/>
+            </w:tcMar>
+            <w:vAlign w:val="center"/>
+          </w:tcPr>
+          <w:p>
+            <w:pPr>
+              <w:jc w:val="left"/>
+            </w:pPr>
+            <w:r>
+              <w:rPr>
+                <w:b w:val="false"/>
+                <w:bCs w:val="false"/>
+                <w:i w:val="false"/>
+                <w:iCs w:val="false"/>
+                <w:sz w:val="19"/>
+                <w:szCs w:val="19"/>
+              </w:rPr>
+              <w:t xml:space="preserve">Supplier/Partner Relationship Management — vertical do eTOM com 5 subprocessos citados no corpus do Assistente (Strategy &amp; Planning, Development &amp; Management, Interface Management, Problem/Issue Management, Settlements &amp; Billing Management); o ITXView cobre esta vertical sozinho, o JourneyGraph cobre as 4 verticais de Assurance.</w:t>
+            </w:r>
+          </w:p>
+        </w:tc>
+      </w:tr>
+      <w:tr>
+        <w:tc>
+          <w:tcPr>
+            <w:tcW w:type="dxa" w:w="2100"/>
+            <w:tcBorders>
+              <w:top w:val="single" w:color="CCCCCC" w:sz="4"/>
+              <w:left w:val="single" w:color="CCCCCC" w:sz="4"/>
+              <w:bottom w:val="single" w:color="CCCCCC" w:sz="4"/>
+              <w:right w:val="single" w:color="CCCCCC" w:sz="4"/>
+            </w:tcBorders>
+            <w:tcMar>
+              <w:top w:type="dxa" w:w="100"/>
+              <w:left w:type="dxa" w:w="120"/>
+              <w:bottom w:type="dxa" w:w="100"/>
+              <w:right w:type="dxa" w:w="120"/>
+            </w:tcMar>
+            <w:vAlign w:val="center"/>
+          </w:tcPr>
+          <w:p>
+            <w:pPr>
+              <w:jc w:val="left"/>
+            </w:pPr>
+            <w:r>
+              <w:rPr>
+                <w:b/>
+                <w:bCs/>
+                <w:i w:val="false"/>
+                <w:iCs w:val="false"/>
+                <w:sz w:val="19"/>
+                <w:szCs w:val="19"/>
+              </w:rPr>
+              <w:t xml:space="preserve">IX.br</w:t>
+            </w:r>
+          </w:p>
+        </w:tc>
+        <w:tc>
+          <w:tcPr>
+            <w:tcW w:type="dxa" w:w="1500"/>
+            <w:tcBorders>
+              <w:top w:val="single" w:color="CCCCCC" w:sz="4"/>
+              <w:left w:val="single" w:color="CCCCCC" w:sz="4"/>
+              <w:bottom w:val="single" w:color="CCCCCC" w:sz="4"/>
+              <w:right w:val="single" w:color="CCCCCC" w:sz="4"/>
+            </w:tcBorders>
+            <w:tcMar>
+              <w:top w:type="dxa" w:w="100"/>
+              <w:left w:type="dxa" w:w="120"/>
+              <w:bottom w:type="dxa" w:w="100"/>
+              <w:right w:type="dxa" w:w="120"/>
+            </w:tcMar>
+            <w:vAlign w:val="center"/>
+          </w:tcPr>
+          <w:p>
+            <w:pPr>
+              <w:jc w:val="left"/>
+            </w:pPr>
+            <w:r>
+              <w:rPr>
+                <w:b w:val="false"/>
+                <w:bCs w:val="false"/>
+                <w:i w:val="false"/>
+                <w:iCs w:val="false"/>
+                <w:color w:val="4A6A8A"/>
+                <w:sz w:val="19"/>
+                <w:szCs w:val="19"/>
+              </w:rPr>
+              <w:t xml:space="preserve">Sigla</w:t>
+            </w:r>
+          </w:p>
+        </w:tc>
+        <w:tc>
+          <w:tcPr>
+            <w:tcW w:type="dxa" w:w="5760"/>
+            <w:tcBorders>
+              <w:top w:val="single" w:color="CCCCCC" w:sz="4"/>
+              <w:left w:val="single" w:color="CCCCCC" w:sz="4"/>
+              <w:bottom w:val="single" w:color="CCCCCC" w:sz="4"/>
+              <w:right w:val="single" w:color="CCCCCC" w:sz="4"/>
+            </w:tcBorders>
+            <w:tcMar>
+              <w:top w:type="dxa" w:w="100"/>
+              <w:left w:type="dxa" w:w="120"/>
+              <w:bottom w:type="dxa" w:w="100"/>
+              <w:right w:type="dxa" w:w="120"/>
+            </w:tcMar>
+            <w:vAlign w:val="center"/>
+          </w:tcPr>
+          <w:p>
+            <w:pPr>
+              <w:jc w:val="left"/>
+            </w:pPr>
+            <w:r>
+              <w:rPr>
+                <w:b w:val="false"/>
+                <w:bCs w:val="false"/>
+                <w:i w:val="false"/>
+                <w:iCs w:val="false"/>
+                <w:sz w:val="19"/>
+                <w:szCs w:val="19"/>
+              </w:rPr>
+              <w:t xml:space="preserve">Ponto de Troca de Tráfego brasileiro — participação em peering citada no card da Lounge.</w:t>
+            </w:r>
+          </w:p>
+        </w:tc>
+      </w:tr>
+      <w:tr>
+        <w:tc>
+          <w:tcPr>
+            <w:tcW w:type="dxa" w:w="2100"/>
+            <w:tcBorders>
+              <w:top w:val="single" w:color="CCCCCC" w:sz="4"/>
+              <w:left w:val="single" w:color="CCCCCC" w:sz="4"/>
+              <w:bottom w:val="single" w:color="CCCCCC" w:sz="4"/>
+              <w:right w:val="single" w:color="CCCCCC" w:sz="4"/>
+            </w:tcBorders>
+            <w:tcMar>
+              <w:top w:type="dxa" w:w="100"/>
+              <w:left w:type="dxa" w:w="120"/>
+              <w:bottom w:type="dxa" w:w="100"/>
+              <w:right w:type="dxa" w:w="120"/>
+            </w:tcMar>
+            <w:vAlign w:val="center"/>
+          </w:tcPr>
+          <w:p>
+            <w:pPr>
+              <w:jc w:val="left"/>
+            </w:pPr>
+            <w:r>
+              <w:rPr>
+                <w:b/>
+                <w:bCs/>
+                <w:i w:val="false"/>
+                <w:iCs w:val="false"/>
+                <w:sz w:val="19"/>
+                <w:szCs w:val="19"/>
+              </w:rPr>
+              <w:t xml:space="preserve">LCBR</w:t>
+            </w:r>
+          </w:p>
+        </w:tc>
+        <w:tc>
+          <w:tcPr>
+            <w:tcW w:type="dxa" w:w="1500"/>
+            <w:tcBorders>
+              <w:top w:val="single" w:color="CCCCCC" w:sz="4"/>
+              <w:left w:val="single" w:color="CCCCCC" w:sz="4"/>
+              <w:bottom w:val="single" w:color="CCCCCC" w:sz="4"/>
+              <w:right w:val="single" w:color="CCCCCC" w:sz="4"/>
+            </w:tcBorders>
+            <w:tcMar>
+              <w:top w:type="dxa" w:w="100"/>
+              <w:left w:type="dxa" w:w="120"/>
+              <w:bottom w:type="dxa" w:w="100"/>
+              <w:right w:type="dxa" w:w="120"/>
+            </w:tcMar>
+            <w:vAlign w:val="center"/>
+          </w:tcPr>
+          <w:p>
+            <w:pPr>
+              <w:jc w:val="left"/>
+            </w:pPr>
+            <w:r>
+              <w:rPr>
+                <w:b w:val="false"/>
+                <w:bCs w:val="false"/>
+                <w:i w:val="false"/>
+                <w:iCs w:val="false"/>
+                <w:color w:val="4A6A8A"/>
+                <w:sz w:val="19"/>
+                <w:szCs w:val="19"/>
+              </w:rPr>
+              <w:t xml:space="preserve">Sigla</w:t>
+            </w:r>
+          </w:p>
+        </w:tc>
+        <w:tc>
+          <w:tcPr>
+            <w:tcW w:type="dxa" w:w="5760"/>
+            <w:tcBorders>
+              <w:top w:val="single" w:color="CCCCCC" w:sz="4"/>
+              <w:left w:val="single" w:color="CCCCCC" w:sz="4"/>
+              <w:bottom w:val="single" w:color="CCCCCC" w:sz="4"/>
+              <w:right w:val="single" w:color="CCCCCC" w:sz="4"/>
+            </w:tcBorders>
+            <w:tcMar>
+              <w:top w:type="dxa" w:w="100"/>
+              <w:left w:type="dxa" w:w="120"/>
+              <w:bottom w:type="dxa" w:w="100"/>
+              <w:right w:type="dxa" w:w="120"/>
+            </w:tcMar>
+            <w:vAlign w:val="center"/>
+          </w:tcPr>
+          <w:p>
+            <w:pPr>
+              <w:jc w:val="left"/>
+            </w:pPr>
+            <w:r>
+              <w:rPr>
+                <w:b w:val="false"/>
+                <w:bCs w:val="false"/>
+                <w:i w:val="false"/>
+                <w:iCs w:val="false"/>
+                <w:sz w:val="19"/>
+                <w:szCs w:val="19"/>
+              </w:rPr>
+              <w:t xml:space="preserve">Least Cost Best Route — motor consultivo que recomenda a rota de menor custo entre caminhos viáveis, combinando custo comercial, qualidade (estado Markov) e compliance; opera em modo consultivo, sem aplicação automática.</w:t>
+            </w:r>
+          </w:p>
+        </w:tc>
+      </w:tr>
+      <w:tr>
+        <w:tc>
+          <w:tcPr>
+            <w:tcW w:type="dxa" w:w="2100"/>
+            <w:tcBorders>
+              <w:top w:val="single" w:color="CCCCCC" w:sz="4"/>
+              <w:left w:val="single" w:color="CCCCCC" w:sz="4"/>
+              <w:bottom w:val="single" w:color="CCCCCC" w:sz="4"/>
+              <w:right w:val="single" w:color="CCCCCC" w:sz="4"/>
+            </w:tcBorders>
+            <w:tcMar>
+              <w:top w:type="dxa" w:w="100"/>
+              <w:left w:type="dxa" w:w="120"/>
+              <w:bottom w:type="dxa" w:w="100"/>
+              <w:right w:type="dxa" w:w="120"/>
+            </w:tcMar>
+            <w:vAlign w:val="center"/>
+          </w:tcPr>
+          <w:p>
+            <w:pPr>
+              <w:jc w:val="left"/>
+            </w:pPr>
+            <w:r>
+              <w:rPr>
+                <w:b/>
+                <w:bCs/>
+                <w:i w:val="false"/>
+                <w:iCs w:val="false"/>
+                <w:sz w:val="19"/>
+                <w:szCs w:val="19"/>
+              </w:rPr>
+              <w:t xml:space="preserve">POI</w:t>
+            </w:r>
+          </w:p>
+        </w:tc>
+        <w:tc>
+          <w:tcPr>
+            <w:tcW w:type="dxa" w:w="1500"/>
+            <w:tcBorders>
+              <w:top w:val="single" w:color="CCCCCC" w:sz="4"/>
+              <w:left w:val="single" w:color="CCCCCC" w:sz="4"/>
+              <w:bottom w:val="single" w:color="CCCCCC" w:sz="4"/>
+              <w:right w:val="single" w:color="CCCCCC" w:sz="4"/>
+            </w:tcBorders>
+            <w:tcMar>
+              <w:top w:type="dxa" w:w="100"/>
+              <w:left w:type="dxa" w:w="120"/>
+              <w:bottom w:type="dxa" w:w="100"/>
+              <w:right w:type="dxa" w:w="120"/>
+            </w:tcMar>
+            <w:vAlign w:val="center"/>
+          </w:tcPr>
+          <w:p>
+            <w:pPr>
+              <w:jc w:val="left"/>
+            </w:pPr>
+            <w:r>
+              <w:rPr>
+                <w:b w:val="false"/>
+                <w:bCs w:val="false"/>
+                <w:i w:val="false"/>
+                <w:iCs w:val="false"/>
+                <w:color w:val="4A6A8A"/>
+                <w:sz w:val="19"/>
+                <w:szCs w:val="19"/>
+              </w:rPr>
+              <w:t xml:space="preserve">Sigla</w:t>
+            </w:r>
+          </w:p>
+        </w:tc>
+        <w:tc>
+          <w:tcPr>
+            <w:tcW w:type="dxa" w:w="5760"/>
+            <w:tcBorders>
+              <w:top w:val="single" w:color="CCCCCC" w:sz="4"/>
+              <w:left w:val="single" w:color="CCCCCC" w:sz="4"/>
+              <w:bottom w:val="single" w:color="CCCCCC" w:sz="4"/>
+              <w:right w:val="single" w:color="CCCCCC" w:sz="4"/>
+            </w:tcBorders>
+            <w:tcMar>
+              <w:top w:type="dxa" w:w="100"/>
+              <w:left w:type="dxa" w:w="120"/>
+              <w:bottom w:type="dxa" w:w="100"/>
+              <w:right w:type="dxa" w:w="120"/>
+            </w:tcMar>
+            <w:vAlign w:val="center"/>
+          </w:tcPr>
+          <w:p>
+            <w:pPr>
+              <w:jc w:val="left"/>
+            </w:pPr>
+            <w:r>
+              <w:rPr>
+                <w:b w:val="false"/>
+                <w:bCs w:val="false"/>
+                <w:i w:val="false"/>
+                <w:iCs w:val="false"/>
+                <w:sz w:val="19"/>
+                <w:szCs w:val="19"/>
+              </w:rPr>
+              <w:t xml:space="preserve">Ponto de Interconexão — ponto de referência em torno do qual o Diagrama H classifica o tráfego.</w:t>
+            </w:r>
+          </w:p>
+        </w:tc>
+      </w:tr>
+      <w:tr>
+        <w:tc>
+          <w:tcPr>
+            <w:tcW w:type="dxa" w:w="2100"/>
+            <w:tcBorders>
+              <w:top w:val="single" w:color="CCCCCC" w:sz="4"/>
+              <w:left w:val="single" w:color="CCCCCC" w:sz="4"/>
+              <w:bottom w:val="single" w:color="CCCCCC" w:sz="4"/>
+              <w:right w:val="single" w:color="CCCCCC" w:sz="4"/>
+            </w:tcBorders>
+            <w:tcMar>
+              <w:top w:type="dxa" w:w="100"/>
+              <w:left w:type="dxa" w:w="120"/>
+              <w:bottom w:type="dxa" w:w="100"/>
+              <w:right w:type="dxa" w:w="120"/>
+            </w:tcMar>
+            <w:vAlign w:val="center"/>
+          </w:tcPr>
+          <w:p>
+            <w:pPr>
+              <w:jc w:val="left"/>
+            </w:pPr>
+            <w:r>
+              <w:rPr>
+                <w:b/>
+                <w:bCs/>
+                <w:i w:val="false"/>
+                <w:iCs w:val="false"/>
+                <w:sz w:val="19"/>
+                <w:szCs w:val="19"/>
+              </w:rPr>
+              <w:t xml:space="preserve">PPI</w:t>
+            </w:r>
+          </w:p>
+        </w:tc>
+        <w:tc>
+          <w:tcPr>
+            <w:tcW w:type="dxa" w:w="1500"/>
+            <w:tcBorders>
+              <w:top w:val="single" w:color="CCCCCC" w:sz="4"/>
+              <w:left w:val="single" w:color="CCCCCC" w:sz="4"/>
+              <w:bottom w:val="single" w:color="CCCCCC" w:sz="4"/>
+              <w:right w:val="single" w:color="CCCCCC" w:sz="4"/>
+            </w:tcBorders>
+            <w:tcMar>
+              <w:top w:type="dxa" w:w="100"/>
+              <w:left w:type="dxa" w:w="120"/>
+              <w:bottom w:type="dxa" w:w="100"/>
+              <w:right w:type="dxa" w:w="120"/>
+            </w:tcMar>
+            <w:vAlign w:val="center"/>
+          </w:tcPr>
+          <w:p>
+            <w:pPr>
+              <w:jc w:val="left"/>
+            </w:pPr>
+            <w:r>
+              <w:rPr>
+                <w:b w:val="false"/>
+                <w:bCs w:val="false"/>
+                <w:i w:val="false"/>
+                <w:iCs w:val="false"/>
+                <w:color w:val="4A6A8A"/>
+                <w:sz w:val="19"/>
+                <w:szCs w:val="19"/>
+              </w:rPr>
+              <w:t xml:space="preserve">Sigla</w:t>
+            </w:r>
+          </w:p>
+        </w:tc>
+        <w:tc>
+          <w:tcPr>
+            <w:tcW w:type="dxa" w:w="5760"/>
+            <w:tcBorders>
+              <w:top w:val="single" w:color="CCCCCC" w:sz="4"/>
+              <w:left w:val="single" w:color="CCCCCC" w:sz="4"/>
+              <w:bottom w:val="single" w:color="CCCCCC" w:sz="4"/>
+              <w:right w:val="single" w:color="CCCCCC" w:sz="4"/>
+            </w:tcBorders>
+            <w:tcMar>
+              <w:top w:type="dxa" w:w="100"/>
+              <w:left w:type="dxa" w:w="120"/>
+              <w:bottom w:type="dxa" w:w="100"/>
+              <w:right w:type="dxa" w:w="120"/>
+            </w:tcMar>
+            <w:vAlign w:val="center"/>
+          </w:tcPr>
+          <w:p>
+            <w:pPr>
+              <w:jc w:val="left"/>
+            </w:pPr>
+            <w:r>
+              <w:rPr>
+                <w:b w:val="false"/>
+                <w:bCs w:val="false"/>
+                <w:i w:val="false"/>
+                <w:iCs w:val="false"/>
+                <w:sz w:val="19"/>
+                <w:szCs w:val="19"/>
+              </w:rPr>
+              <w:t xml:space="preserve">Ponto de Presença de Interconexão — unidade de interconexão de voz mapeada pelo produto (ex. PPI-01 a PPI-04, com Claro, Vivo, Embratel, TIM).</w:t>
+            </w:r>
+          </w:p>
+        </w:tc>
+      </w:tr>
+      <w:tr>
+        <w:tc>
+          <w:tcPr>
+            <w:tcW w:type="dxa" w:w="2100"/>
+            <w:tcBorders>
+              <w:top w:val="single" w:color="CCCCCC" w:sz="4"/>
+              <w:left w:val="single" w:color="CCCCCC" w:sz="4"/>
+              <w:bottom w:val="single" w:color="CCCCCC" w:sz="4"/>
+              <w:right w:val="single" w:color="CCCCCC" w:sz="4"/>
+            </w:tcBorders>
+            <w:tcMar>
+              <w:top w:type="dxa" w:w="100"/>
+              <w:left w:type="dxa" w:w="120"/>
+              <w:bottom w:type="dxa" w:w="100"/>
+              <w:right w:type="dxa" w:w="120"/>
+            </w:tcMar>
+            <w:vAlign w:val="center"/>
+          </w:tcPr>
+          <w:p>
+            <w:pPr>
+              <w:jc w:val="left"/>
+            </w:pPr>
+            <w:r>
+              <w:rPr>
+                <w:b/>
+                <w:bCs/>
+                <w:i w:val="false"/>
+                <w:iCs w:val="false"/>
+                <w:sz w:val="19"/>
+                <w:szCs w:val="19"/>
+              </w:rPr>
+              <w:t xml:space="preserve">RGI</w:t>
+            </w:r>
+          </w:p>
+        </w:tc>
+        <w:tc>
+          <w:tcPr>
+            <w:tcW w:type="dxa" w:w="1500"/>
+            <w:tcBorders>
+              <w:top w:val="single" w:color="CCCCCC" w:sz="4"/>
+              <w:left w:val="single" w:color="CCCCCC" w:sz="4"/>
+              <w:bottom w:val="single" w:color="CCCCCC" w:sz="4"/>
+              <w:right w:val="single" w:color="CCCCCC" w:sz="4"/>
+            </w:tcBorders>
+            <w:tcMar>
+              <w:top w:type="dxa" w:w="100"/>
+              <w:left w:type="dxa" w:w="120"/>
+              <w:bottom w:type="dxa" w:w="100"/>
+              <w:right w:type="dxa" w:w="120"/>
+            </w:tcMar>
+            <w:vAlign w:val="center"/>
+          </w:tcPr>
+          <w:p>
+            <w:pPr>
+              <w:jc w:val="left"/>
+            </w:pPr>
+            <w:r>
+              <w:rPr>
+                <w:b w:val="false"/>
+                <w:bCs w:val="false"/>
+                <w:i w:val="false"/>
+                <w:iCs w:val="false"/>
+                <w:color w:val="4A6A8A"/>
+                <w:sz w:val="19"/>
+                <w:szCs w:val="19"/>
+              </w:rPr>
+              <w:t xml:space="preserve">Norma/Framework</w:t>
+            </w:r>
+          </w:p>
+        </w:tc>
+        <w:tc>
+          <w:tcPr>
+            <w:tcW w:type="dxa" w:w="5760"/>
+            <w:tcBorders>
+              <w:top w:val="single" w:color="CCCCCC" w:sz="4"/>
+              <w:left w:val="single" w:color="CCCCCC" w:sz="4"/>
+              <w:bottom w:val="single" w:color="CCCCCC" w:sz="4"/>
+              <w:right w:val="single" w:color="CCCCCC" w:sz="4"/>
+            </w:tcBorders>
+            <w:tcMar>
+              <w:top w:type="dxa" w:w="100"/>
+              <w:left w:type="dxa" w:w="120"/>
+              <w:bottom w:type="dxa" w:w="100"/>
+              <w:right w:type="dxa" w:w="120"/>
+            </w:tcMar>
+            <w:vAlign w:val="center"/>
+          </w:tcPr>
+          <w:p>
+            <w:pPr>
+              <w:jc w:val="left"/>
+            </w:pPr>
+            <w:r>
+              <w:rPr>
+                <w:b w:val="false"/>
+                <w:bCs w:val="false"/>
+                <w:i w:val="false"/>
+                <w:iCs w:val="false"/>
+                <w:sz w:val="19"/>
+                <w:szCs w:val="19"/>
+              </w:rPr>
+              <w:t xml:space="preserve">Regulamento Geral de Interconexão — citado no corpus do Assistente quanto à simetria de SLA entre operadoras.</w:t>
+            </w:r>
+          </w:p>
+        </w:tc>
+      </w:tr>
+      <w:tr>
+        <w:tc>
+          <w:tcPr>
+            <w:tcW w:type="dxa" w:w="2100"/>
+            <w:tcBorders>
+              <w:top w:val="single" w:color="CCCCCC" w:sz="4"/>
+              <w:left w:val="single" w:color="CCCCCC" w:sz="4"/>
+              <w:bottom w:val="single" w:color="CCCCCC" w:sz="4"/>
+              <w:right w:val="single" w:color="CCCCCC" w:sz="4"/>
+            </w:tcBorders>
+            <w:tcMar>
+              <w:top w:type="dxa" w:w="100"/>
+              <w:left w:type="dxa" w:w="120"/>
+              <w:bottom w:type="dxa" w:w="100"/>
+              <w:right w:type="dxa" w:w="120"/>
+            </w:tcMar>
+            <w:vAlign w:val="center"/>
+          </w:tcPr>
+          <w:p>
+            <w:pPr>
+              <w:jc w:val="left"/>
+            </w:pPr>
+            <w:r>
+              <w:rPr>
+                <w:b/>
+                <w:bCs/>
+                <w:i w:val="false"/>
+                <w:iCs w:val="false"/>
+                <w:sz w:val="19"/>
+                <w:szCs w:val="19"/>
+              </w:rPr>
+              <w:t xml:space="preserve">SCM</w:t>
+            </w:r>
+          </w:p>
+        </w:tc>
+        <w:tc>
+          <w:tcPr>
+            <w:tcW w:type="dxa" w:w="1500"/>
+            <w:tcBorders>
+              <w:top w:val="single" w:color="CCCCCC" w:sz="4"/>
+              <w:left w:val="single" w:color="CCCCCC" w:sz="4"/>
+              <w:bottom w:val="single" w:color="CCCCCC" w:sz="4"/>
+              <w:right w:val="single" w:color="CCCCCC" w:sz="4"/>
+            </w:tcBorders>
+            <w:tcMar>
+              <w:top w:type="dxa" w:w="100"/>
+              <w:left w:type="dxa" w:w="120"/>
+              <w:bottom w:type="dxa" w:w="100"/>
+              <w:right w:type="dxa" w:w="120"/>
+            </w:tcMar>
+            <w:vAlign w:val="center"/>
+          </w:tcPr>
+          <w:p>
+            <w:pPr>
+              <w:jc w:val="left"/>
+            </w:pPr>
+            <w:r>
+              <w:rPr>
+                <w:b w:val="false"/>
+                <w:bCs w:val="false"/>
+                <w:i w:val="false"/>
+                <w:iCs w:val="false"/>
+                <w:color w:val="4A6A8A"/>
+                <w:sz w:val="19"/>
+                <w:szCs w:val="19"/>
+              </w:rPr>
+              <w:t xml:space="preserve">Sigla</w:t>
+            </w:r>
+          </w:p>
+        </w:tc>
+        <w:tc>
+          <w:tcPr>
+            <w:tcW w:type="dxa" w:w="5760"/>
+            <w:tcBorders>
+              <w:top w:val="single" w:color="CCCCCC" w:sz="4"/>
+              <w:left w:val="single" w:color="CCCCCC" w:sz="4"/>
+              <w:bottom w:val="single" w:color="CCCCCC" w:sz="4"/>
+              <w:right w:val="single" w:color="CCCCCC" w:sz="4"/>
+            </w:tcBorders>
+            <w:tcMar>
+              <w:top w:type="dxa" w:w="100"/>
+              <w:left w:type="dxa" w:w="120"/>
+              <w:bottom w:type="dxa" w:w="100"/>
+              <w:right w:type="dxa" w:w="120"/>
+            </w:tcMar>
+            <w:vAlign w:val="center"/>
+          </w:tcPr>
+          <w:p>
+            <w:pPr>
+              <w:jc w:val="left"/>
+            </w:pPr>
+            <w:r>
+              <w:rPr>
+                <w:b w:val="false"/>
+                <w:bCs w:val="false"/>
+                <w:i w:val="false"/>
+                <w:iCs w:val="false"/>
+                <w:sz w:val="19"/>
+                <w:szCs w:val="19"/>
+              </w:rPr>
+              <w:t xml:space="preserve">Serviço de Comunicação Multimídia — categoria regulatória Anatel à qual a exigência de numeração E.164 será estendida a partir de março de 2027.</w:t>
+            </w:r>
+          </w:p>
+        </w:tc>
+      </w:tr>
+    </w:tbl>
+    <w:p>
+      <w:pPr>
+        <w:spacing w:after="0" w:before="0"/>
+        <w:jc w:val="both"/>
+      </w:pPr>
+      <w:r>
+        <w:rPr>
+          <w:b w:val="false"/>
+          <w:bCs w:val="false"/>
+          <w:i w:val="false"/>
+          <w:iCs w:val="false"/>
+        </w:rPr>
+        <w:t xml:space="preserve">Termos institucionais recorrentes em toda a série de documentos da Lounge de Soluções ISP (RAG, CDR) seguem a mesma definição em todos os Product Reports desta série, por força do padrão de documentação da Vísent (docs/PADRAO_DOCUMENTACAO_PRODUTO.md).</w:t>
+      </w:r>
+    </w:p>
     <w:sectPr>
       <w:headerReference w:type="default" r:id="rId9"/>
       <w:footerReference w:type="default" r:id="rId10"/>

</xml_diff>